<commit_message>
Seconde version de l'affiche
</commit_message>
<xml_diff>
--- a/pictures/Affiche-Plot/Plot.docx
+++ b/pictures/Affiche-Plot/Plot.docx
@@ -13,9 +13,9 @@
         <mc:AlternateContent>
           <mc:Choice Requires="wpc">
             <w:drawing>
-              <wp:inline distT="0" distB="0" distL="0" distR="0" wp14:anchorId="2FD9138B" wp14:editId="2EA36189">
-                <wp:extent cx="8280000" cy="6699250"/>
-                <wp:effectExtent l="0" t="0" r="6985" b="6350"/>
+              <wp:inline distT="0" distB="0" distL="0" distR="0" wp14:anchorId="2FD9138B" wp14:editId="3DBF0FCB">
+                <wp:extent cx="8743950" cy="6667500"/>
+                <wp:effectExtent l="0" t="0" r="19050" b="19050"/>
                 <wp:docPr id="1456931834" name="Zone de dessin 2"/>
                 <wp:cNvGraphicFramePr>
                   <a:graphicFrameLocks xmlns:a="http://schemas.openxmlformats.org/drawingml/2006/main"/>
@@ -24,13 +24,16 @@
                   <a:graphicData uri="http://schemas.microsoft.com/office/word/2010/wordprocessingCanvas">
                     <wpc:wpc>
                       <wpc:bg>
-                        <a:solidFill>
-                          <a:prstClr val="white"/>
-                        </a:solidFill>
+                        <a:blipFill>
+                          <a:blip r:embed="rId5"/>
+                          <a:tile tx="0" ty="0" sx="100000" sy="100000" flip="none" algn="tl"/>
+                        </a:blipFill>
                       </wpc:bg>
                       <wpc:whole>
                         <a:ln>
-                          <a:noFill/>
+                          <a:solidFill>
+                            <a:schemeClr val="tx1"/>
+                          </a:solidFill>
                         </a:ln>
                       </wpc:whole>
                       <pic:pic xmlns:pic="http://schemas.openxmlformats.org/drawingml/2006/picture">
@@ -41,7 +44,7 @@
                           </pic:cNvPicPr>
                         </pic:nvPicPr>
                         <pic:blipFill rotWithShape="1">
-                          <a:blip r:embed="rId5">
+                          <a:blip r:embed="rId6">
                             <a:extLst>
                               <a:ext uri="{28A0092B-C50C-407E-A947-70E740481C1C}">
                                 <a14:useLocalDpi xmlns:a14="http://schemas.microsoft.com/office/drawing/2010/main" val="0"/>
@@ -55,7 +58,7 @@
                         </pic:blipFill>
                         <pic:spPr bwMode="auto">
                           <a:xfrm>
-                            <a:off x="5634277" y="617270"/>
+                            <a:off x="5853403" y="388670"/>
                             <a:ext cx="2480382" cy="2440506"/>
                           </a:xfrm>
                           <a:prstGeom prst="rect">
@@ -77,15 +80,13 @@
                         <wps:cNvSpPr txBox="1"/>
                         <wps:spPr>
                           <a:xfrm>
-                            <a:off x="40858" y="256998"/>
+                            <a:off x="252999" y="142698"/>
                             <a:ext cx="5300590" cy="914645"/>
                           </a:xfrm>
                           <a:prstGeom prst="rect">
                             <a:avLst/>
                           </a:prstGeom>
-                          <a:solidFill>
-                            <a:schemeClr val="lt1"/>
-                          </a:solidFill>
+                          <a:noFill/>
                           <a:ln w="6350">
                             <a:noFill/>
                           </a:ln>
@@ -135,15 +136,13 @@
                         <wps:cNvSpPr txBox="1"/>
                         <wps:spPr>
                           <a:xfrm>
-                            <a:off x="170679" y="1197173"/>
+                            <a:off x="382820" y="1044773"/>
                             <a:ext cx="4952677" cy="2527109"/>
                           </a:xfrm>
                           <a:prstGeom prst="rect">
                             <a:avLst/>
                           </a:prstGeom>
-                          <a:solidFill>
-                            <a:schemeClr val="lt1"/>
-                          </a:solidFill>
+                          <a:noFill/>
                           <a:ln w="6350">
                             <a:noFill/>
                           </a:ln>
@@ -169,17 +168,7 @@
                                   <w:szCs w:val="44"/>
                                   <w14:ligatures w14:val="none"/>
                                 </w:rPr>
-                                <w:t>V</w:t>
-                              </w:r>
-                              <w:r>
-                                <w:rPr>
-                                  <w:rFonts w:cs="Calibri"/>
-                                  <w:kern w:val="0"/>
-                                  <w:sz w:val="44"/>
-                                  <w:szCs w:val="44"/>
-                                  <w14:ligatures w14:val="none"/>
-                                </w:rPr>
-                                <w:t xml:space="preserve">ous incarnez un stratège médiéval engagé dans la </w:t>
+                                <w:t xml:space="preserve">Vous incarnez un stratège médiéval engagé dans la </w:t>
                               </w:r>
                               <w:r>
                                 <w:rPr>
@@ -287,7 +276,7 @@
                           </pic:cNvPicPr>
                         </pic:nvPicPr>
                         <pic:blipFill rotWithShape="1">
-                          <a:blip r:embed="rId6">
+                          <a:blip r:embed="rId7">
                             <a:extLst>
                               <a:ext uri="{28A0092B-C50C-407E-A947-70E740481C1C}">
                                 <a14:useLocalDpi xmlns:a14="http://schemas.microsoft.com/office/drawing/2010/main" val="0"/>
@@ -301,7 +290,7 @@
                         </pic:blipFill>
                         <pic:spPr bwMode="auto">
                           <a:xfrm>
-                            <a:off x="706639" y="3696748"/>
+                            <a:off x="840040" y="3525298"/>
                             <a:ext cx="4126466" cy="1302709"/>
                           </a:xfrm>
                           <a:prstGeom prst="rect">
@@ -326,8 +315,17 @@
                           </pic:cNvPicPr>
                         </pic:nvPicPr>
                         <pic:blipFill rotWithShape="1">
-                          <a:blip r:embed="rId7">
+                          <a:blip r:embed="rId8">
                             <a:extLst>
+                              <a:ext uri="{BEBA8EAE-BF5A-486C-A8C5-ECC9F3942E4B}">
+                                <a14:imgProps xmlns:a14="http://schemas.microsoft.com/office/drawing/2010/main">
+                                  <a14:imgLayer r:embed="rId9">
+                                    <a14:imgEffect>
+                                      <a14:colorTemperature colorTemp="11200"/>
+                                    </a14:imgEffect>
+                                  </a14:imgLayer>
+                                </a14:imgProps>
+                              </a:ext>
                               <a:ext uri="{28A0092B-C50C-407E-A947-70E740481C1C}">
                                 <a14:useLocalDpi xmlns:a14="http://schemas.microsoft.com/office/drawing/2010/main" val="0"/>
                               </a:ext>
@@ -340,7 +338,7 @@
                         </pic:blipFill>
                         <pic:spPr bwMode="auto">
                           <a:xfrm>
-                            <a:off x="5660000" y="3283261"/>
+                            <a:off x="5859441" y="3054661"/>
                             <a:ext cx="2468067" cy="2481778"/>
                           </a:xfrm>
                           <a:prstGeom prst="rect">
@@ -360,7 +358,7 @@
                           </pic:cNvPicPr>
                         </pic:nvPicPr>
                         <pic:blipFill rotWithShape="1">
-                          <a:blip r:embed="rId8">
+                          <a:blip r:embed="rId10">
                             <a:extLst>
                               <a:ext uri="{28A0092B-C50C-407E-A947-70E740481C1C}">
                                 <a14:useLocalDpi xmlns:a14="http://schemas.microsoft.com/office/drawing/2010/main" val="0"/>
@@ -374,7 +372,7 @@
                         </pic:blipFill>
                         <pic:spPr bwMode="auto">
                           <a:xfrm>
-                            <a:off x="266741" y="5105790"/>
+                            <a:off x="478882" y="4981965"/>
                             <a:ext cx="3458845" cy="1405255"/>
                           </a:xfrm>
                           <a:prstGeom prst="rect">
@@ -399,7 +397,7 @@
                           </pic:cNvPicPr>
                         </pic:nvPicPr>
                         <pic:blipFill rotWithShape="1">
-                          <a:blip r:embed="rId9">
+                          <a:blip r:embed="rId11">
                             <a:extLst>
                               <a:ext uri="{28A0092B-C50C-407E-A947-70E740481C1C}">
                                 <a14:useLocalDpi xmlns:a14="http://schemas.microsoft.com/office/drawing/2010/main" val="0"/>
@@ -413,7 +411,7 @@
                         </pic:blipFill>
                         <pic:spPr bwMode="auto">
                           <a:xfrm>
-                            <a:off x="3958370" y="5105684"/>
+                            <a:off x="4170511" y="4981859"/>
                             <a:ext cx="1431290" cy="1413510"/>
                           </a:xfrm>
                           <a:prstGeom prst="rect">
@@ -430,6 +428,54 @@
                           </a:extLst>
                         </pic:spPr>
                       </pic:pic>
+                      <wps:wsp>
+                        <wps:cNvPr id="162034651" name="Zone de texte 162034651"/>
+                        <wps:cNvSpPr txBox="1"/>
+                        <wps:spPr>
+                          <a:xfrm>
+                            <a:off x="5871181" y="5723223"/>
+                            <a:ext cx="2444750" cy="346075"/>
+                          </a:xfrm>
+                          <a:prstGeom prst="rect">
+                            <a:avLst/>
+                          </a:prstGeom>
+                          <a:noFill/>
+                          <a:ln w="6350">
+                            <a:noFill/>
+                          </a:ln>
+                        </wps:spPr>
+                        <wps:txbx>
+                          <w:txbxContent>
+                            <w:p>
+                              <w:pPr>
+                                <w:rPr>
+                                  <w:rFonts w:ascii="Segoe UI" w:hAnsi="Segoe UI" w:cs="Segoe UI"/>
+                                  <w:b/>
+                                  <w:bCs/>
+                                  <w:sz w:val="32"/>
+                                  <w:szCs w:val="32"/>
+                                </w:rPr>
+                              </w:pPr>
+                              <w:r>
+                                <w:rPr>
+                                  <w:rFonts w:ascii="Segoe UI" w:hAnsi="Segoe UI" w:cs="Segoe UI"/>
+                                  <w:b/>
+                                  <w:bCs/>
+                                  <w:sz w:val="32"/>
+                                  <w:szCs w:val="32"/>
+                                </w:rPr>
+                                <w:t>lucas.borboleta@free.fr</w:t>
+                              </w:r>
+                            </w:p>
+                          </w:txbxContent>
+                        </wps:txbx>
+                        <wps:bodyPr rot="0" spcFirstLastPara="0" vertOverflow="overflow" horzOverflow="overflow" vert="horz" wrap="none" lIns="91440" tIns="45720" rIns="91440" bIns="45720" numCol="1" spcCol="0" rtlCol="0" fromWordArt="0" anchor="t" anchorCtr="0" forceAA="0" compatLnSpc="1">
+                          <a:prstTxWarp prst="textNoShape">
+                            <a:avLst/>
+                          </a:prstTxWarp>
+                          <a:noAutofit/>
+                        </wps:bodyPr>
+                      </wps:wsp>
                     </wpc:wpc>
                   </a:graphicData>
                 </a:graphic>
@@ -438,7 +484,7 @@
           </mc:Choice>
           <mc:Fallback>
             <w:pict>
-              <v:group w14:anchorId="2FD9138B" id="Zone de dessin 2" o:spid="_x0000_s1026" editas="canvas" style="width:651.95pt;height:527.5pt;mso-position-horizontal-relative:char;mso-position-vertical-relative:line" coordsize="82797,66992" o:gfxdata="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">
+              <v:group w14:anchorId="2FD9138B" id="Zone de dessin 2" o:spid="_x0000_s1026" editas="canvas" style="width:688.5pt;height:525pt;mso-position-horizontal-relative:char;mso-position-vertical-relative:line" coordsize="87439,66675" o:gfxdata="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">
                 <v:shapetype id="_x0000_t75" coordsize="21600,21600" o:spt="75" o:preferrelative="t" path="m@4@5l@4@11@9@11@9@5xe" filled="f" stroked="f">
                   <v:stroke joinstyle="miter"/>
                   <v:formulas>
@@ -458,18 +504,18 @@
                   <v:path o:extrusionok="f" gradientshapeok="t" o:connecttype="rect"/>
                   <o:lock v:ext="edit" aspectratio="t"/>
                 </v:shapetype>
-                <v:shape id="_x0000_s1027" type="#_x0000_t75" style="position:absolute;width:82797;height:66992;visibility:visible;mso-wrap-style:square" filled="t">
-                  <v:fill o:detectmouseclick="t"/>
+                <v:shape id="_x0000_s1027" type="#_x0000_t75" style="position:absolute;width:87439;height:66675;visibility:visible;mso-wrap-style:square" filled="t" stroked="t" strokecolor="black [3213]">
+                  <v:fill r:id="rId12" o:title="" recolor="t" rotate="t" o:detectmouseclick="t" type="tile"/>
                   <v:path o:connecttype="none"/>
                 </v:shape>
-                <v:shape id="Image 333304154" o:spid="_x0000_s1028" type="#_x0000_t75" style="position:absolute;left:56342;top:6172;width:24804;height:24405;visibility:visible;mso-wrap-style:square" o:gfxdata="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">
-                  <v:imagedata r:id="rId10" o:title="" croptop="1330f" cropbottom="23345f" cropright="24693f"/>
+                <v:shape id="Image 333304154" o:spid="_x0000_s1028" type="#_x0000_t75" style="position:absolute;left:58534;top:3886;width:24803;height:24405;visibility:visible;mso-wrap-style:square" o:gfxdata="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">
+                  <v:imagedata r:id="rId13" o:title="" croptop="1330f" cropbottom="23345f" cropright="24693f"/>
                 </v:shape>
                 <v:shapetype id="_x0000_t202" coordsize="21600,21600" o:spt="202" path="m,l,21600r21600,l21600,xe">
                   <v:stroke joinstyle="miter"/>
                   <v:path gradientshapeok="t" o:connecttype="rect"/>
                 </v:shapetype>
-                <v:shape id="Zone de texte 320047100" o:spid="_x0000_s1029" type="#_x0000_t202" style="position:absolute;left:408;top:2569;width:53006;height:9147;visibility:visible;mso-wrap-style:none;v-text-anchor:top" o:gfxdata="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" fillcolor="white [3201]" stroked="f" strokeweight=".5pt">
+                <v:shape id="Zone de texte 320047100" o:spid="_x0000_s1029" type="#_x0000_t202" style="position:absolute;left:2529;top:1426;width:53006;height:9147;visibility:visible;mso-wrap-style:none;v-text-anchor:top" o:gfxdata="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" filled="f" stroked="f" strokeweight=".5pt">
                   <v:textbox inset="1mm,1mm,1mm,1mm">
                     <w:txbxContent>
                       <w:p>
@@ -504,7 +550,7 @@
                     </w:txbxContent>
                   </v:textbox>
                 </v:shape>
-                <v:shape id="Zone de texte 1357797467" o:spid="_x0000_s1030" type="#_x0000_t202" style="position:absolute;left:1706;top:11971;width:49527;height:25271;visibility:visible;mso-wrap-style:square;v-text-anchor:top" o:gfxdata="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" fillcolor="white [3201]" stroked="f" strokeweight=".5pt">
+                <v:shape id="Zone de texte 1357797467" o:spid="_x0000_s1030" type="#_x0000_t202" style="position:absolute;left:3828;top:10447;width:49526;height:25271;visibility:visible;mso-wrap-style:square;v-text-anchor:top" o:gfxdata="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" filled="f" stroked="f" strokeweight=".5pt">
                   <v:textbox>
                     <w:txbxContent>
                       <w:p>
@@ -526,17 +572,7 @@
                             <w:szCs w:val="44"/>
                             <w14:ligatures w14:val="none"/>
                           </w:rPr>
-                          <w:t>V</w:t>
-                        </w:r>
-                        <w:r>
-                          <w:rPr>
-                            <w:rFonts w:cs="Calibri"/>
-                            <w:kern w:val="0"/>
-                            <w:sz w:val="44"/>
-                            <w:szCs w:val="44"/>
-                            <w14:ligatures w14:val="none"/>
-                          </w:rPr>
-                          <w:t xml:space="preserve">ous incarnez un stratège médiéval engagé dans la </w:t>
+                          <w:t xml:space="preserve">Vous incarnez un stratège médiéval engagé dans la </w:t>
                         </w:r>
                         <w:r>
                           <w:rPr>
@@ -630,17 +666,44 @@
                     </w:txbxContent>
                   </v:textbox>
                 </v:shape>
-                <v:shape id="Image 1875234150" o:spid="_x0000_s1031" type="#_x0000_t75" style="position:absolute;left:7066;top:36967;width:41265;height:13027;visibility:visible;mso-wrap-style:square" o:gfxdata="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">
-                  <v:imagedata r:id="rId11" o:title="" cropbottom="10347f" cropleft="17684f" cropright="17718f"/>
+                <v:shape id="Image 1875234150" o:spid="_x0000_s1031" type="#_x0000_t75" style="position:absolute;left:8400;top:35252;width:41265;height:13028;visibility:visible;mso-wrap-style:square" o:gfxdata="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">
+                  <v:imagedata r:id="rId14" o:title="" cropbottom="10347f" cropleft="17684f" cropright="17718f"/>
                 </v:shape>
-                <v:shape id="Image 636109403" o:spid="_x0000_s1032" type="#_x0000_t75" style="position:absolute;left:56600;top:32832;width:24680;height:24818;visibility:visible;mso-wrap-style:square" o:gfxdata="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">
-                  <v:imagedata r:id="rId12" o:title="" croptop="4116f" cropbottom="4399f" cropleft="3948f" cropright="3336f"/>
+                <v:shape id="Image 636109403" o:spid="_x0000_s1032" type="#_x0000_t75" style="position:absolute;left:58594;top:30546;width:24681;height:24818;visibility:visible;mso-wrap-style:square" o:gfxdata="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">
+                  <v:imagedata r:id="rId15" o:title="" croptop="4116f" cropbottom="4399f" cropleft="3948f" cropright="3336f"/>
                 </v:shape>
-                <v:shape id="Image 1122105632" o:spid="_x0000_s1033" type="#_x0000_t75" style="position:absolute;left:2667;top:51057;width:34588;height:14053;visibility:visible;mso-wrap-style:square" o:gfxdata="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">
-                  <v:imagedata r:id="rId13" o:title="" cropbottom="10754f" cropleft="21116f" cropright="21222f"/>
+                <v:shape id="Image 1122105632" o:spid="_x0000_s1033" type="#_x0000_t75" style="position:absolute;left:4788;top:49819;width:34589;height:14053;visibility:visible;mso-wrap-style:square" o:gfxdata="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">
+                  <v:imagedata r:id="rId16" o:title="" cropbottom="10754f" cropleft="21116f" cropright="21222f"/>
                 </v:shape>
-                <v:shape id="Image 36068730" o:spid="_x0000_s1034" type="#_x0000_t75" style="position:absolute;left:39583;top:51056;width:14313;height:14135;visibility:visible;mso-wrap-style:square" o:gfxdata="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">
-                  <v:imagedata r:id="rId14" o:title="" cropbottom="10418f" cropleft="27951f" cropright="27981f"/>
+                <v:shape id="Image 36068730" o:spid="_x0000_s1034" type="#_x0000_t75" style="position:absolute;left:41705;top:49818;width:14313;height:14135;visibility:visible;mso-wrap-style:square" o:gfxdata="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">
+                  <v:imagedata r:id="rId17" o:title="" cropbottom="10418f" cropleft="27951f" cropright="27981f"/>
+                </v:shape>
+                <v:shape id="Zone de texte 162034651" o:spid="_x0000_s1035" type="#_x0000_t202" style="position:absolute;left:58711;top:57232;width:24448;height:3460;visibility:visible;mso-wrap-style:none;v-text-anchor:top" o:gfxdata="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" filled="f" stroked="f" strokeweight=".5pt">
+                  <v:textbox>
+                    <w:txbxContent>
+                      <w:p>
+                        <w:pPr>
+                          <w:rPr>
+                            <w:rFonts w:ascii="Segoe UI" w:hAnsi="Segoe UI" w:cs="Segoe UI"/>
+                            <w:b/>
+                            <w:bCs/>
+                            <w:sz w:val="32"/>
+                            <w:szCs w:val="32"/>
+                          </w:rPr>
+                        </w:pPr>
+                        <w:r>
+                          <w:rPr>
+                            <w:rFonts w:ascii="Segoe UI" w:hAnsi="Segoe UI" w:cs="Segoe UI"/>
+                            <w:b/>
+                            <w:bCs/>
+                            <w:sz w:val="32"/>
+                            <w:szCs w:val="32"/>
+                          </w:rPr>
+                          <w:t>lucas.borboleta@free.fr</w:t>
+                        </w:r>
+                      </w:p>
+                    </w:txbxContent>
+                  </v:textbox>
                 </v:shape>
                 <w10:anchorlock/>
               </v:group>

</xml_diff>